<commit_message>
Update Annex 31 translation
Co-Authored-By: Claude Opus 4.6 <noreply@anthropic.com>
Claude-Session: https://claude.ai/code/session_01N9ZP28hxEfPoWHf2qaE8QM
</commit_message>
<xml_diff>
--- a/Computer Engineering, Software Engineering, Computer systems & their softwares/Annexes/Annex №31 Admission Regulations to Master programs.docx
+++ b/Computer Engineering, Software Engineering, Computer systems & their softwares/Annexes/Annex №31 Admission Regulations to Master programs.docx
@@ -10073,17 +10073,16 @@
           <w:color w:val="000000"/>
           <w:sz w:val="28"/>
         </w:rPr>
-        <w:t xml:space="preserve">46. Within the framework of an intergovernmental or interdepartmental </w:t>
-      </w:r>
-      <w:r>
-        <w:rPr>
-          <w:rFonts w:ascii="ArialMT" w:hAnsi="ArialMT" w:eastAsia="ArialMT"/>
-          <w:b w:val="0"/>
-          <w:i w:val="0"/>
-          <w:color w:val="000000"/>
-          <w:sz w:val="28"/>
-        </w:rPr>
-        <w:t xml:space="preserve">agreement or an agreement between higher education institutions, students who </w:t>
+        <w:t xml:space="preserve">46. Hukumatlararo yoki idoralararo kelishuv yoki oliy ta'lim muassasalari o'rtasidagi kelishuv doirasida, </w:t>
+      </w:r>
+      <w:r>
+        <w:rPr>
+          <w:rFonts w:ascii="ArialMT" w:hAnsi="ArialMT" w:eastAsia="ArialMT"/>
+          <w:b w:val="0"/>
+          <w:i w:val="0"/>
+          <w:color w:val="000000"/>
+          <w:sz w:val="28"/>
+        </w:rPr>
       </w:r>
     </w:p>
     <w:p>

</xml_diff>